<commit_message>
fix: Repair broken spacing and typos in Google-Teams chat exhibit docs
Two source exhibit files (Included and Out Of Scope) had whitespace-only
Word runs missing the xml:space="preserve" attribute, causing words to
render with no spacing in the app's docx preview. Also fixes several
carried-over typos (Goup, Colured, Formates, seperate).
</commit_message>
<xml_diff>
--- a/backend-exhibits/Google Chat to Microsoft Teams (1).docx
+++ b/backend-exhibits/Google Chat to Microsoft Teams (1).docx
@@ -61,7 +61,7 @@
                 <w:spacing w:val="-6"/>
                 <w:sz w:val="21"/>
               </w:rPr>
-              <w:t> </w:t>
+              <w:t xml:space="preserve"> </w:t>
             </w:r>
             <w:r>
               <w:rPr>
@@ -76,7 +76,7 @@
                 <w:spacing w:val="-5"/>
                 <w:sz w:val="21"/>
               </w:rPr>
-              <w:t> </w:t>
+              <w:t xml:space="preserve"> </w:t>
             </w:r>
             <w:r>
               <w:rPr>
@@ -91,7 +91,7 @@
                 <w:spacing w:val="-5"/>
                 <w:sz w:val="21"/>
               </w:rPr>
-              <w:t> </w:t>
+              <w:t xml:space="preserve"> </w:t>
             </w:r>
             <w:r>
               <w:rPr>
@@ -106,7 +106,7 @@
                 <w:spacing w:val="-5"/>
                 <w:sz w:val="21"/>
               </w:rPr>
-              <w:t> </w:t>
+              <w:t xml:space="preserve"> </w:t>
             </w:r>
             <w:r>
               <w:rPr>
@@ -121,7 +121,7 @@
                 <w:spacing w:val="-5"/>
                 <w:sz w:val="21"/>
               </w:rPr>
-              <w:t> </w:t>
+              <w:t xml:space="preserve"> </w:t>
             </w:r>
             <w:r>
               <w:rPr>
@@ -136,7 +136,7 @@
                 <w:spacing w:val="-5"/>
                 <w:sz w:val="21"/>
               </w:rPr>
-              <w:t> </w:t>
+              <w:t xml:space="preserve"> </w:t>
             </w:r>
             <w:r>
               <w:rPr>
@@ -151,7 +151,7 @@
                 <w:spacing w:val="-5"/>
                 <w:sz w:val="21"/>
               </w:rPr>
-              <w:t> </w:t>
+              <w:t xml:space="preserve"> </w:t>
             </w:r>
             <w:r>
               <w:rPr>
@@ -193,7 +193,7 @@
                 <w:spacing w:val="-2"/>
                 <w:sz w:val="21"/>
               </w:rPr>
-              <w:t> </w:t>
+              <w:t xml:space="preserve"> </w:t>
             </w:r>
             <w:r>
               <w:rPr>
@@ -490,7 +490,7 @@
                 <w:b/>
                 <w:sz w:val="21"/>
               </w:rPr>
-              <w:t>Goup </w:t>
+              <w:t>Group </w:t>
             </w:r>
             <w:r>
               <w:rPr>
@@ -775,15 +775,15 @@
                 <w:spacing w:val="-8"/>
                 <w:sz w:val="21"/>
               </w:rPr>
-              <w:t> </w:t>
-            </w:r>
-            <w:r>
-              <w:rPr>
-                <w:b/>
-                <w:spacing w:val="-2"/>
-                <w:sz w:val="21"/>
-              </w:rPr>
-              <w:t>Formates</w:t>
+              <w:t xml:space="preserve"> </w:t>
+            </w:r>
+            <w:r>
+              <w:rPr>
+                <w:b/>
+                <w:spacing w:val="-2"/>
+                <w:sz w:val="21"/>
+              </w:rPr>
+              <w:t>Formats</w:t>
             </w:r>
           </w:p>
         </w:tc>
@@ -814,7 +814,7 @@
                 <w:spacing w:val="8"/>
                 <w:sz w:val="21"/>
               </w:rPr>
-              <w:t> </w:t>
+              <w:t xml:space="preserve"> </w:t>
             </w:r>
             <w:r>
               <w:rPr>
@@ -829,14 +829,14 @@
                 <w:spacing w:val="9"/>
                 <w:sz w:val="21"/>
               </w:rPr>
-              <w:t> </w:t>
-            </w:r>
-            <w:r>
-              <w:rPr>
-                <w:rFonts w:ascii="Arial" w:hAnsi="Arial" w:cs="Arial" w:eastAsia="Arial"/>
-                <w:sz w:val="21"/>
-              </w:rPr>
-              <w:t>Colured</w:t>
+              <w:t xml:space="preserve"> </w:t>
+            </w:r>
+            <w:r>
+              <w:rPr>
+                <w:rFonts w:ascii="Arial" w:hAnsi="Arial" w:cs="Arial" w:eastAsia="Arial"/>
+                <w:sz w:val="21"/>
+              </w:rPr>
+              <w:t>Coloured</w:t>
             </w:r>
             <w:r>
               <w:rPr>
@@ -844,7 +844,7 @@
                 <w:spacing w:val="9"/>
                 <w:sz w:val="21"/>
               </w:rPr>
-              <w:t> </w:t>
+              <w:t xml:space="preserve"> </w:t>
             </w:r>
             <w:r>
               <w:rPr>
@@ -859,7 +859,7 @@
                 <w:spacing w:val="8"/>
                 <w:sz w:val="21"/>
               </w:rPr>
-              <w:t> </w:t>
+              <w:t xml:space="preserve"> </w:t>
             </w:r>
             <w:r>
               <w:rPr>
@@ -874,7 +874,7 @@
                 <w:spacing w:val="9"/>
                 <w:sz w:val="21"/>
               </w:rPr>
-              <w:t> </w:t>
+              <w:t xml:space="preserve"> </w:t>
             </w:r>
             <w:r>
               <w:rPr>
@@ -889,7 +889,7 @@
                 <w:spacing w:val="9"/>
                 <w:sz w:val="21"/>
               </w:rPr>
-              <w:t> </w:t>
+              <w:t xml:space="preserve"> </w:t>
             </w:r>
             <w:r>
               <w:rPr>
@@ -904,7 +904,7 @@
                 <w:spacing w:val="8"/>
                 <w:sz w:val="21"/>
               </w:rPr>
-              <w:t> </w:t>
+              <w:t xml:space="preserve"> </w:t>
             </w:r>
             <w:r>
               <w:rPr>
@@ -919,7 +919,7 @@
                 <w:spacing w:val="9"/>
                 <w:sz w:val="21"/>
               </w:rPr>
-              <w:t> </w:t>
+              <w:t xml:space="preserve"> </w:t>
             </w:r>
             <w:r>
               <w:rPr>
@@ -1014,7 +1014,7 @@
                 <w:spacing w:val="-8"/>
                 <w:sz w:val="21"/>
               </w:rPr>
-              <w:t> </w:t>
+              <w:t xml:space="preserve"> </w:t>
             </w:r>
             <w:r>
               <w:rPr>
@@ -1029,7 +1029,7 @@
                 <w:spacing w:val="-8"/>
                 <w:sz w:val="21"/>
               </w:rPr>
-              <w:t> </w:t>
+              <w:t xml:space="preserve"> </w:t>
             </w:r>
             <w:r>
               <w:rPr>
@@ -1044,7 +1044,7 @@
                 <w:spacing w:val="-8"/>
                 <w:sz w:val="21"/>
               </w:rPr>
-              <w:t> </w:t>
+              <w:t xml:space="preserve"> </w:t>
             </w:r>
             <w:r>
               <w:rPr>
@@ -1059,7 +1059,7 @@
                 <w:spacing w:val="-8"/>
                 <w:sz w:val="21"/>
               </w:rPr>
-              <w:t> </w:t>
+              <w:t xml:space="preserve"> </w:t>
             </w:r>
             <w:r>
               <w:rPr>
@@ -1074,7 +1074,7 @@
                 <w:spacing w:val="-8"/>
                 <w:sz w:val="21"/>
               </w:rPr>
-              <w:t> </w:t>
+              <w:t xml:space="preserve"> </w:t>
             </w:r>
             <w:r>
               <w:rPr>
@@ -1263,7 +1263,7 @@
                 <w:spacing w:val="-4"/>
                 <w:sz w:val="21"/>
               </w:rPr>
-              <w:t> </w:t>
+              <w:t xml:space="preserve"> </w:t>
             </w:r>
             <w:r>
               <w:rPr>

</xml_diff>